<commit_message>
cascade: chore(constitution): bump submodule pointer for SpecKit-004 Foundational batch
constitution 0ff780d..b72361b: lands the fast-dev-cycles Foundational batch
(lib/fc_common.{py,sh}, lib/host_guard.sh, the full test suite) after T014
achieved a clean GO across 3 independent Opus review rounds -- every finding
across all rounds independently re-verified by the conductor directly
against the real files, never merely trusted from a reviewer/fixer's report.
Final state: run_all 9/9 suites 0 failed, 15/15 mutations caught,
test_fc_common_red.sh 233/233, test_host_guard_red.sh 131/131.

docs/CONTINUATION.md updated in the same commit per §12.10/§11.4.205.

Co-Authored-By: Claude Sonnet 5 <noreply@anthropic.com>

(committed by parent commit_all.sh cascade depth=1)
</commit_message>
<xml_diff>
--- a/docs/scripts/track_branch_label.docx
+++ b/docs/scripts/track_branch_label.docx
@@ -26,7 +26,7 @@
         <w:t xml:space="preserve"> </w:t>
       </w:r>
       <w:r>
-        <w:t xml:space="preserve">1</w:t>
+        <w:t xml:space="preserve">2</w:t>
       </w:r>
       <w:r>
         <w:t xml:space="preserve"> </w:t>
@@ -42,7 +42,7 @@
         <w:t xml:space="preserve"> </w:t>
       </w:r>
       <w:r>
-        <w:t xml:space="preserve">2026-07-26T12:18:28Z</w:t>
+        <w:t xml:space="preserve">2026-09-26T14:40:00Z</w:t>
       </w:r>
       <w:r>
         <w:t xml:space="preserve"> </w:t>
@@ -1534,7 +1534,7 @@
         <w:t xml:space="preserve"> </w:t>
       </w:r>
       <w:r>
-        <w:t xml:space="preserve">§11.4.211 Fable-</w:t>
+        <w:t xml:space="preserve">§11.4.211 Opus-</w:t>
       </w:r>
       <w:r>
         <w:rPr>

</xml_diff>